<commit_message>
Remove SpaceX branding, humanize site copy, and rebuild resume
- Finish stripping the SpaceX theme: no starfield, no Starship goal, neutral copy
- Rewrite home, Windpack, GE Vernova, fusion, and cryo pages in a personal voice
- Replace visible template placeholders with real content
- Drop DOE attribution from Collegiate Wind Competition mentions
- Resume: remove Semantic Search, Cryogenic Rotary Union, and Student Energy Club
- Resume: add Senior Design TA and rocket avionics / remote ground station project

Co-Authored-By: Claude Fable 5 <noreply@anthropic.com>
</commit_message>
<xml_diff>
--- a/assets/Luke-Caffarey-Resume.docx
+++ b/assets/Luke-Caffarey-Resume.docx
@@ -51,7 +51,7 @@
           <w:color w:val="1A1A1A"/>
           <w:sz w:val="18"/>
         </w:rPr>
-        <w:t>Mechanical engineering student (GPA 3.889) with hands-on experience across fusion research, utility-scale wind, and cryogenic hardware design. Focused on building reliable hardware in service of SpaceX's mission to make life multiplanetary.</w:t>
+        <w:t>Mechanical engineering student (GPA 3.889) with hands-on experience across fusion research and utility-scale wind, now building custom rocket avionics and remote telemetry hardware. Drawn to flight hardware that has to work the first time.</w:t>
       </w:r>
     </w:p>
     <w:p>
@@ -187,7 +187,60 @@
           <w:color w:val="1A1A1A"/>
           <w:sz w:val="18"/>
         </w:rPr>
+        <w:t>Automated a weekly safety-critical reporting workflow in Python and SQL, replacing a manual multi-step process.</w:t>
+      </w:r>
+    </w:p>
+    <w:p>
+      <w:pPr>
+        <w:pStyle w:val="ListBullet"/>
+        <w:spacing w:after="20"/>
+        <w:ind w:left="288"/>
+      </w:pPr>
+      <w:r>
+        <w:rPr>
+          <w:color w:val="1A1A1A"/>
+          <w:sz w:val="18"/>
+        </w:rPr>
         <w:t>Apply CAD and mechanical analysis to hardware that must operate reliably in the field for decades.</w:t>
+      </w:r>
+    </w:p>
+    <w:p>
+      <w:pPr>
+        <w:tabs>
+          <w:tab w:pos="9072" w:val="right"/>
+        </w:tabs>
+        <w:spacing w:after="0" w:before="40"/>
+      </w:pPr>
+      <w:r>
+        <w:rPr>
+          <w:b/>
+          <w:color w:val="1A1A1A"/>
+          <w:sz w:val="19"/>
+        </w:rPr>
+        <w:t>NC State Mechanical Engineering, Senior Design Teaching Assistant</w:t>
+      </w:r>
+      <w:r>
+        <w:rPr>
+          <w:i/>
+          <w:color w:val="555555"/>
+          <w:sz w:val="17"/>
+        </w:rPr>
+        <w:tab/>
+        <w:t>Aug 2026 to Present  |  Raleigh, NC</w:t>
+      </w:r>
+    </w:p>
+    <w:p>
+      <w:pPr>
+        <w:pStyle w:val="ListBullet"/>
+        <w:spacing w:after="20"/>
+        <w:ind w:left="288"/>
+      </w:pPr>
+      <w:r>
+        <w:rPr>
+          <w:color w:val="1A1A1A"/>
+          <w:sz w:val="18"/>
+        </w:rPr>
+        <w:t>Support senior capstone design teams through design reviews, prototyping guidance, and documentation feedback.</w:t>
       </w:r>
     </w:p>
     <w:p>
@@ -272,7 +325,7 @@
           <w:color w:val="1A1A1A"/>
           <w:sz w:val="19"/>
         </w:rPr>
-        <w:t>Cryogenic Rotary Union, Independent Hardware Project</w:t>
+        <w:t>High-Power Rocket Avionics and Remote Ground Station (in progress)</w:t>
       </w:r>
       <w:r>
         <w:rPr>
@@ -295,7 +348,7 @@
           <w:color w:val="1A1A1A"/>
           <w:sz w:val="18"/>
         </w:rPr>
-        <w:t>Designing a sub-scale, bench-top cryogenic rotary union to transfer liquid nitrogen (LN2, -196 C) across a rotating joint, demonstrating extreme thermal gradient, dynamic sealing, and first-principles thermal-structural design.</w:t>
+        <w:t>Designing a custom flight computer (Teensy 4.1, IMU, barometer, GPS) that logs 100 Hz flight data and streams live telemetry over a 915 MHz LoRa radio link.</w:t>
       </w:r>
     </w:p>
     <w:p>
@@ -309,7 +362,7 @@
           <w:color w:val="1A1A1A"/>
           <w:sz w:val="18"/>
         </w:rPr>
-        <w:t>Architecture: 316L stainless inner fluid shaft, vacuum-jacketed and Aerogel insulation, spring-energized PTFE lip seals, and dry ceramic hybrid bearings thermally isolated from the cold core.</w:t>
+        <w:t>Building a Raspberry Pi ground station serving a real-time web dashboard for altitude, velocity, and recovery tracking, remotely accessible from anywhere over a Tailscale mesh VPN.</w:t>
       </w:r>
     </w:p>
     <w:p>
@@ -323,37 +376,7 @@
           <w:color w:val="1A1A1A"/>
           <w:sz w:val="18"/>
         </w:rPr>
-        <w:t>Executing full CAD, coupled thermal-structural FEA, and fluid CFD, followed by machining, RTD and pressure-transducer instrumentation, and live rotational testing.</w:t>
-      </w:r>
-    </w:p>
-    <w:p>
-      <w:pPr>
-        <w:tabs>
-          <w:tab w:pos="9072" w:val="right"/>
-        </w:tabs>
-        <w:spacing w:after="0" w:before="40"/>
-      </w:pPr>
-      <w:r>
-        <w:rPr>
-          <w:b/>
-          <w:color w:val="1A1A1A"/>
-          <w:sz w:val="19"/>
-        </w:rPr>
-        <w:t>RCA Semantic Search Tool, Software Project</w:t>
-      </w:r>
-    </w:p>
-    <w:p>
-      <w:pPr>
-        <w:pStyle w:val="ListBullet"/>
-        <w:spacing w:after="20"/>
-        <w:ind w:left="288"/>
-      </w:pPr>
-      <w:r>
-        <w:rPr>
-          <w:color w:val="1A1A1A"/>
-          <w:sz w:val="18"/>
-        </w:rPr>
-        <w:t>Built a semantic search tool over root-cause-analysis records to retrieve similar past failures and resolutions.</w:t>
+        <w:t>Flight-testing the full telemetry stack on a quadcopter to shake out radio dropouts, range limits, and antenna placement before it flies on a high-power rocket.</w:t>
       </w:r>
     </w:p>
     <w:p>
@@ -408,7 +431,7 @@
           <w:color w:val="1A1A1A"/>
           <w:sz w:val="18"/>
         </w:rPr>
-        <w:t>Founded a 10-member team to compete in the U.S. Department of Energy Collegiate Wind Competition.</w:t>
+        <w:t>Founded a 10-member team to compete in the Collegiate Wind Competition and led it to its first competition appearance in 2026.</w:t>
       </w:r>
     </w:p>
     <w:p>
@@ -423,59 +446,6 @@
           <w:sz w:val="18"/>
         </w:rPr>
         <w:t>Lead design, fabrication, and testing of scaled wind turbine systems and sustainability proposals.</w:t>
-      </w:r>
-    </w:p>
-    <w:p>
-      <w:pPr>
-        <w:tabs>
-          <w:tab w:pos="9072" w:val="right"/>
-        </w:tabs>
-        <w:spacing w:after="0" w:before="40"/>
-      </w:pPr>
-      <w:r>
-        <w:rPr>
-          <w:b/>
-          <w:color w:val="1A1A1A"/>
-          <w:sz w:val="19"/>
-        </w:rPr>
-        <w:t>Student Energy Club, NC State, Treasurer</w:t>
-      </w:r>
-      <w:r>
-        <w:rPr>
-          <w:i/>
-          <w:color w:val="555555"/>
-          <w:sz w:val="17"/>
-        </w:rPr>
-        <w:tab/>
-        <w:t>Aug 2025 to Present</w:t>
-      </w:r>
-    </w:p>
-    <w:p>
-      <w:pPr>
-        <w:pStyle w:val="ListBullet"/>
-        <w:spacing w:after="20"/>
-        <w:ind w:left="288"/>
-      </w:pPr>
-      <w:r>
-        <w:rPr>
-          <w:color w:val="1A1A1A"/>
-          <w:sz w:val="18"/>
-        </w:rPr>
-        <w:t>Registered the club as a 501(c)(3) non-profit organization.</w:t>
-      </w:r>
-    </w:p>
-    <w:p>
-      <w:pPr>
-        <w:pStyle w:val="ListBullet"/>
-        <w:spacing w:after="20"/>
-        <w:ind w:left="288"/>
-      </w:pPr>
-      <w:r>
-        <w:rPr>
-          <w:color w:val="1A1A1A"/>
-          <w:sz w:val="18"/>
-        </w:rPr>
-        <w:t>Initiated sponsor outreach, establishing connections with 5+ potential industry partners.</w:t>
       </w:r>
     </w:p>
     <w:p>
@@ -605,7 +575,7 @@
           <w:color w:val="1A1A1A"/>
           <w:sz w:val="18"/>
         </w:rPr>
-        <w:t>SolidWorks, GD&amp;T, design for manufacturing</w:t>
+        <w:t>SolidWorks, design for manufacturing, 3D printing</w:t>
       </w:r>
     </w:p>
     <w:p>
@@ -618,14 +588,14 @@
           <w:color w:val="1A1A1A"/>
           <w:sz w:val="18"/>
         </w:rPr>
-        <w:t xml:space="preserve">Analysis: </w:t>
+        <w:t xml:space="preserve">Programming and Data: </w:t>
       </w:r>
       <w:r>
         <w:rPr>
           <w:color w:val="1A1A1A"/>
           <w:sz w:val="18"/>
         </w:rPr>
-        <w:t>Thermal-structural FEA, fluid CFD, MATLAB, Python (signal processing, data analysis)</w:t>
+        <w:t>Python (signal processing, data analysis), MATLAB, SQL, C++ (embedded)</w:t>
       </w:r>
     </w:p>
     <w:p>
@@ -645,7 +615,7 @@
           <w:color w:val="1A1A1A"/>
           <w:sz w:val="18"/>
         </w:rPr>
-        <w:t>Machining, fabrication, sensor instrumentation (RTDs, pressure transducers), cryogenics</w:t>
+        <w:t>Fabrication, soldering, sensor integration (IMU, barometer, GPS), LoRa radio telemetry</w:t>
       </w:r>
     </w:p>
     <w:p>
@@ -658,14 +628,14 @@
           <w:color w:val="1A1A1A"/>
           <w:sz w:val="18"/>
         </w:rPr>
-        <w:t xml:space="preserve">Materials and Mechanics: </w:t>
+        <w:t xml:space="preserve">Systems: </w:t>
       </w:r>
       <w:r>
         <w:rPr>
           <w:color w:val="1A1A1A"/>
           <w:sz w:val="18"/>
         </w:rPr>
-        <w:t>316L stainless, PTFE seals, ceramic bearings, thermodynamics, fluid mechanics</w:t>
+        <w:t>Raspberry Pi and Linux, Git, remote networking (SSH, Tailscale), thermodynamics, fluid mechanics</w:t>
       </w:r>
     </w:p>
     <w:sectPr>

</xml_diff>